<commit_message>
Per-mine illustration: full sentences, bullet points, no shorthand
</commit_message>
<xml_diff>
--- a/APC-2026-Diamante-PerMine-Performance.docx
+++ b/APC-2026-Diamante-PerMine-Performance.docx
@@ -9,7 +9,7 @@
           <w:color w:val="1F3D6B"/>
           <w:sz w:val="28"/>
         </w:rPr>
-        <w:t>Diamante — Per-mine performance: Mine 1 vs Mine 2 (worked illustration, FY2026)</w:t>
+        <w:t>Diamante — Per-mine performance: Mine 1 versus Mine 2 (worked illustration, FY2026)</w:t>
       </w:r>
     </w:p>
     <w:p>
@@ -20,9 +20,9 @@
         <w:rPr>
           <w:b w:val="0"/>
           <w:i/>
-          <w:sz w:val="18"/>
+          <w:sz w:val="19"/>
         </w:rPr>
-        <w:t>Companion to the performance-measures note. Because only revenue and the non-financial impairment are disclosed per mine, the other lines are split on stated assumptions — treat the figures as illustrative of the METHOD, not audited results. R millions.</w:t>
+        <w:t>This is a companion to the performance-measures note. Because the pre-release only discloses revenue and the non-financial impairment for each mine separately, I have split the remaining lines using clearly-stated assumptions. The figures should therefore be read as an illustration of the method rather than as audited results. All amounts are in R millions.</w:t>
       </w:r>
     </w:p>
     <w:p>
@@ -38,67 +38,55 @@
           <w:color w:val="1F3D6B"/>
           <w:sz w:val="26"/>
         </w:rPr>
-        <w:t>Assumptions used to split the two mines</w:t>
+        <w:t>The assumptions I have used to split the two mines</w:t>
       </w:r>
     </w:p>
     <w:p>
       <w:pPr>
         <w:pStyle w:val="ListBullet"/>
-        <w:spacing w:after="60"/>
+        <w:spacing w:after="80"/>
       </w:pPr>
       <w:r>
         <w:rPr>
-          <w:b/>
+          <w:sz w:val="20"/>
         </w:rPr>
-        <w:t xml:space="preserve">Disclosed per mine: </w:t>
-      </w:r>
-      <w:r>
-        <w:t>Revenue (Mine 1 R1 233m; Mine 2 R630m) and the non-financial impairment (Mine 1 R630m; Mine 2 R333m).</w:t>
+        <w:t>The following amounts are disclosed for each mine in the pre-release: revenue (Mine 1 earned R1 233m and Mine 2 earned R630m) and the non-financial impairment (R630m was recognised on Mine 1 and R333m on Mine 2).</w:t>
       </w:r>
     </w:p>
     <w:p>
       <w:pPr>
         <w:pStyle w:val="ListBullet"/>
-        <w:spacing w:after="60"/>
+        <w:spacing w:after="80"/>
       </w:pPr>
       <w:r>
         <w:rPr>
-          <w:b/>
+          <w:sz w:val="20"/>
         </w:rPr>
-        <w:t xml:space="preserve">Split pro-rata to revenue (Mine 1 66.2% / Mine 2 33.8%): </w:t>
-      </w:r>
-      <w:r>
-        <w:t>mining costs, other corporate expenditure, the R207m financial impairment, and net investment. (Ideally use mine-level cost and asset data / carats — I would request the divisional balance sheets.)</w:t>
+        <w:t>I have split the remaining shared amounts — the mining costs, the other corporate expenditure, the R207m financial-asset impairment, and the net investment — in proportion to each mine’s revenue (Mine 1 takes 66.2% and Mine 2 takes 33.8%). In a real engagement I would instead ask the client for each mine’s own costs, assets and carats, because a revenue-based split is only an approximation.</w:t>
       </w:r>
     </w:p>
     <w:p>
       <w:pPr>
         <w:pStyle w:val="ListBullet"/>
-        <w:spacing w:after="60"/>
+        <w:spacing w:after="80"/>
       </w:pPr>
       <w:r>
         <w:rPr>
-          <w:b/>
+          <w:sz w:val="20"/>
         </w:rPr>
-        <w:t xml:space="preserve">Divisional NOPAT </w:t>
-      </w:r>
-      <w:r>
-        <w:t>excludes group finance income/expense (financing is a group matter), so it is operating result × (1 − 27%). This is why the mine NOPATs sum to (R1 196m), not the group’s (R979m) which retained finance income.</w:t>
+        <w:t>The divisional NOPAT (net operating profit after tax) is calculated as the operating result multiplied by 73% (that is, after 27% tax), and it deliberately excludes the group’s finance income and finance expense, because financing is managed at group level rather than by each mine. This is the reason the two mines’ NOPAT figures add up to (R1 196m) rather than to the group figure of (R979m), which had retained the group’s finance income.</w:t>
       </w:r>
     </w:p>
     <w:p>
       <w:pPr>
         <w:pStyle w:val="ListBullet"/>
-        <w:spacing w:after="60"/>
+        <w:spacing w:after="80"/>
       </w:pPr>
       <w:r>
         <w:rPr>
-          <w:b/>
+          <w:sz w:val="20"/>
         </w:rPr>
-        <w:t xml:space="preserve">WACC 12% assumed; </w:t>
-      </w:r>
-      <w:r>
-        <w:t>Mine 2 is shown also at a risk-adjusted 14% (older / lower-grade, under strategic review).</w:t>
+        <w:t>I have assumed a weighted average cost of capital (WACC) of 12%. I have also shown Mine 2 at a risk-adjusted WACC of 14%, because it is the older, lower-grade mine whose future is under review and therefore carries more risk.</w:t>
       </w:r>
     </w:p>
     <w:p>
@@ -114,7 +102,7 @@
           <w:color w:val="1F3D6B"/>
           <w:sz w:val="26"/>
         </w:rPr>
-        <w:t>Worked calculation — Mine 1 vs Mine 2 (FY2026)</w:t>
+        <w:t>The worked calculation — Mine 1 versus Mine 2 (FY2026)</w:t>
       </w:r>
     </w:p>
     <w:tbl>
@@ -134,7 +122,7 @@
       <w:tr>
         <w:tc>
           <w:tcPr>
-            <w:tcW w:type="dxa" w:w="3744"/>
+            <w:tcW w:type="dxa" w:w="3888"/>
             <w:shd w:val="clear" w:fill="1f3d6b"/>
           </w:tcPr>
           <w:p>
@@ -145,13 +133,13 @@
                 <w:color w:val="FFFFFF"/>
                 <w:sz w:val="18"/>
               </w:rPr>
-              <w:t>Line</w:t>
+              <w:t>Line item</w:t>
             </w:r>
           </w:p>
         </w:tc>
         <w:tc>
           <w:tcPr>
-            <w:tcW w:type="dxa" w:w="1224"/>
+            <w:tcW w:type="dxa" w:w="1152"/>
             <w:shd w:val="clear" w:fill="1f3d6b"/>
           </w:tcPr>
           <w:p>
@@ -168,7 +156,7 @@
         </w:tc>
         <w:tc>
           <w:tcPr>
-            <w:tcW w:type="dxa" w:w="1224"/>
+            <w:tcW w:type="dxa" w:w="1152"/>
             <w:shd w:val="clear" w:fill="1f3d6b"/>
           </w:tcPr>
           <w:p>
@@ -185,7 +173,7 @@
         </w:tc>
         <w:tc>
           <w:tcPr>
-            <w:tcW w:type="dxa" w:w="1224"/>
+            <w:tcW w:type="dxa" w:w="1152"/>
             <w:shd w:val="clear" w:fill="1f3d6b"/>
           </w:tcPr>
           <w:p>
@@ -202,7 +190,7 @@
         </w:tc>
         <w:tc>
           <w:tcPr>
-            <w:tcW w:type="dxa" w:w="2880"/>
+            <w:tcW w:type="dxa" w:w="2952"/>
             <w:shd w:val="clear" w:fill="1f3d6b"/>
           </w:tcPr>
           <w:p>
@@ -213,7 +201,7 @@
                 <w:color w:val="FFFFFF"/>
                 <w:sz w:val="18"/>
               </w:rPr>
-              <w:t>Basis</w:t>
+              <w:t>How this line was arrived at</w:t>
             </w:r>
           </w:p>
         </w:tc>
@@ -221,7 +209,7 @@
       <w:tr>
         <w:tc>
           <w:tcPr>
-            <w:tcW w:type="dxa" w:w="3744"/>
+            <w:tcW w:type="dxa" w:w="3888"/>
           </w:tcPr>
           <w:p>
             <w:r/>
@@ -235,7 +223,7 @@
         </w:tc>
         <w:tc>
           <w:tcPr>
-            <w:tcW w:type="dxa" w:w="1224"/>
+            <w:tcW w:type="dxa" w:w="1152"/>
           </w:tcPr>
           <w:p>
             <w:r/>
@@ -249,7 +237,7 @@
         </w:tc>
         <w:tc>
           <w:tcPr>
-            <w:tcW w:type="dxa" w:w="1224"/>
+            <w:tcW w:type="dxa" w:w="1152"/>
           </w:tcPr>
           <w:p>
             <w:r/>
@@ -263,7 +251,7 @@
         </w:tc>
         <w:tc>
           <w:tcPr>
-            <w:tcW w:type="dxa" w:w="1224"/>
+            <w:tcW w:type="dxa" w:w="1152"/>
           </w:tcPr>
           <w:p>
             <w:r/>
@@ -277,7 +265,7 @@
         </w:tc>
         <w:tc>
           <w:tcPr>
-            <w:tcW w:type="dxa" w:w="2880"/>
+            <w:tcW w:type="dxa" w:w="2952"/>
           </w:tcPr>
           <w:p>
             <w:r/>
@@ -285,7 +273,7 @@
               <w:rPr>
                 <w:sz w:val="18"/>
               </w:rPr>
-              <w:t>Disclosed</w:t>
+              <w:t>Disclosed separately for each mine</w:t>
             </w:r>
           </w:p>
         </w:tc>
@@ -293,7 +281,7 @@
       <w:tr>
         <w:tc>
           <w:tcPr>
-            <w:tcW w:type="dxa" w:w="3744"/>
+            <w:tcW w:type="dxa" w:w="3888"/>
           </w:tcPr>
           <w:p>
             <w:r/>
@@ -307,7 +295,7 @@
         </w:tc>
         <w:tc>
           <w:tcPr>
-            <w:tcW w:type="dxa" w:w="1224"/>
+            <w:tcW w:type="dxa" w:w="1152"/>
           </w:tcPr>
           <w:p>
             <w:r/>
@@ -321,7 +309,7 @@
         </w:tc>
         <w:tc>
           <w:tcPr>
-            <w:tcW w:type="dxa" w:w="1224"/>
+            <w:tcW w:type="dxa" w:w="1152"/>
           </w:tcPr>
           <w:p>
             <w:r/>
@@ -335,7 +323,7 @@
         </w:tc>
         <w:tc>
           <w:tcPr>
-            <w:tcW w:type="dxa" w:w="1224"/>
+            <w:tcW w:type="dxa" w:w="1152"/>
           </w:tcPr>
           <w:p>
             <w:r/>
@@ -349,7 +337,7 @@
         </w:tc>
         <w:tc>
           <w:tcPr>
-            <w:tcW w:type="dxa" w:w="2880"/>
+            <w:tcW w:type="dxa" w:w="2952"/>
           </w:tcPr>
           <w:p>
             <w:r/>
@@ -357,7 +345,7 @@
               <w:rPr>
                 <w:sz w:val="18"/>
               </w:rPr>
-              <w:t>Pro-rata to revenue</w:t>
+              <w:t>Split in proportion to revenue</w:t>
             </w:r>
           </w:p>
         </w:tc>
@@ -365,7 +353,7 @@
       <w:tr>
         <w:tc>
           <w:tcPr>
-            <w:tcW w:type="dxa" w:w="3744"/>
+            <w:tcW w:type="dxa" w:w="3888"/>
           </w:tcPr>
           <w:p>
             <w:r/>
@@ -379,7 +367,7 @@
         </w:tc>
         <w:tc>
           <w:tcPr>
-            <w:tcW w:type="dxa" w:w="1224"/>
+            <w:tcW w:type="dxa" w:w="1152"/>
           </w:tcPr>
           <w:p>
             <w:r/>
@@ -393,7 +381,7 @@
         </w:tc>
         <w:tc>
           <w:tcPr>
-            <w:tcW w:type="dxa" w:w="1224"/>
+            <w:tcW w:type="dxa" w:w="1152"/>
           </w:tcPr>
           <w:p>
             <w:r/>
@@ -407,7 +395,7 @@
         </w:tc>
         <w:tc>
           <w:tcPr>
-            <w:tcW w:type="dxa" w:w="1224"/>
+            <w:tcW w:type="dxa" w:w="1152"/>
           </w:tcPr>
           <w:p>
             <w:r/>
@@ -421,7 +409,7 @@
         </w:tc>
         <w:tc>
           <w:tcPr>
-            <w:tcW w:type="dxa" w:w="2880"/>
+            <w:tcW w:type="dxa" w:w="2952"/>
           </w:tcPr>
           <w:p>
             <w:r/>
@@ -429,7 +417,7 @@
               <w:rPr>
                 <w:sz w:val="18"/>
               </w:rPr>
-              <w:t>Pro-rata to revenue</w:t>
+              <w:t>Split in proportion to revenue</w:t>
             </w:r>
           </w:p>
         </w:tc>
@@ -437,7 +425,7 @@
       <w:tr>
         <w:tc>
           <w:tcPr>
-            <w:tcW w:type="dxa" w:w="3744"/>
+            <w:tcW w:type="dxa" w:w="3888"/>
             <w:shd w:val="clear" w:fill="eef2f8"/>
           </w:tcPr>
           <w:p>
@@ -447,13 +435,13 @@
                 <w:b/>
                 <w:sz w:val="18"/>
               </w:rPr>
-              <w:t>Operating result BEFORE impairment</w:t>
+              <w:t>Operating result before impairment</w:t>
             </w:r>
           </w:p>
         </w:tc>
         <w:tc>
           <w:tcPr>
-            <w:tcW w:type="dxa" w:w="1224"/>
+            <w:tcW w:type="dxa" w:w="1152"/>
             <w:shd w:val="clear" w:fill="eef2f8"/>
           </w:tcPr>
           <w:p>
@@ -469,7 +457,7 @@
         </w:tc>
         <w:tc>
           <w:tcPr>
-            <w:tcW w:type="dxa" w:w="1224"/>
+            <w:tcW w:type="dxa" w:w="1152"/>
             <w:shd w:val="clear" w:fill="eef2f8"/>
           </w:tcPr>
           <w:p>
@@ -485,7 +473,7 @@
         </w:tc>
         <w:tc>
           <w:tcPr>
-            <w:tcW w:type="dxa" w:w="1224"/>
+            <w:tcW w:type="dxa" w:w="1152"/>
             <w:shd w:val="clear" w:fill="eef2f8"/>
           </w:tcPr>
           <w:p>
@@ -501,7 +489,7 @@
         </w:tc>
         <w:tc>
           <w:tcPr>
-            <w:tcW w:type="dxa" w:w="2880"/>
+            <w:tcW w:type="dxa" w:w="2952"/>
             <w:shd w:val="clear" w:fill="eef2f8"/>
           </w:tcPr>
           <w:p>
@@ -511,7 +499,7 @@
                 <w:b/>
                 <w:sz w:val="18"/>
               </w:rPr>
-              <w:t>Both mines lose money even before impairment</w:t>
+              <w:t>Each mine makes a loss even before any impairment</w:t>
             </w:r>
           </w:p>
         </w:tc>
@@ -519,7 +507,7 @@
       <w:tr>
         <w:tc>
           <w:tcPr>
-            <w:tcW w:type="dxa" w:w="3744"/>
+            <w:tcW w:type="dxa" w:w="3888"/>
           </w:tcPr>
           <w:p>
             <w:r/>
@@ -527,13 +515,13 @@
               <w:rPr>
                 <w:sz w:val="18"/>
               </w:rPr>
-              <w:t>Impairment — non-financial</w:t>
+              <w:t>Impairment of non-financial assets</w:t>
             </w:r>
           </w:p>
         </w:tc>
         <w:tc>
           <w:tcPr>
-            <w:tcW w:type="dxa" w:w="1224"/>
+            <w:tcW w:type="dxa" w:w="1152"/>
           </w:tcPr>
           <w:p>
             <w:r/>
@@ -547,7 +535,7 @@
         </w:tc>
         <w:tc>
           <w:tcPr>
-            <w:tcW w:type="dxa" w:w="1224"/>
+            <w:tcW w:type="dxa" w:w="1152"/>
           </w:tcPr>
           <w:p>
             <w:r/>
@@ -561,7 +549,7 @@
         </w:tc>
         <w:tc>
           <w:tcPr>
-            <w:tcW w:type="dxa" w:w="1224"/>
+            <w:tcW w:type="dxa" w:w="1152"/>
           </w:tcPr>
           <w:p>
             <w:r/>
@@ -575,7 +563,7 @@
         </w:tc>
         <w:tc>
           <w:tcPr>
-            <w:tcW w:type="dxa" w:w="2880"/>
+            <w:tcW w:type="dxa" w:w="2952"/>
           </w:tcPr>
           <w:p>
             <w:r/>
@@ -583,7 +571,7 @@
               <w:rPr>
                 <w:sz w:val="18"/>
               </w:rPr>
-              <w:t>Disclosed per mine</w:t>
+              <w:t>Disclosed separately for each mine</w:t>
             </w:r>
           </w:p>
         </w:tc>
@@ -591,7 +579,7 @@
       <w:tr>
         <w:tc>
           <w:tcPr>
-            <w:tcW w:type="dxa" w:w="3744"/>
+            <w:tcW w:type="dxa" w:w="3888"/>
           </w:tcPr>
           <w:p>
             <w:r/>
@@ -599,13 +587,13 @@
               <w:rPr>
                 <w:sz w:val="18"/>
               </w:rPr>
-              <w:t>Impairment — financial</w:t>
+              <w:t>Impairment of financial assets</w:t>
             </w:r>
           </w:p>
         </w:tc>
         <w:tc>
           <w:tcPr>
-            <w:tcW w:type="dxa" w:w="1224"/>
+            <w:tcW w:type="dxa" w:w="1152"/>
           </w:tcPr>
           <w:p>
             <w:r/>
@@ -619,7 +607,7 @@
         </w:tc>
         <w:tc>
           <w:tcPr>
-            <w:tcW w:type="dxa" w:w="1224"/>
+            <w:tcW w:type="dxa" w:w="1152"/>
           </w:tcPr>
           <w:p>
             <w:r/>
@@ -633,7 +621,7 @@
         </w:tc>
         <w:tc>
           <w:tcPr>
-            <w:tcW w:type="dxa" w:w="1224"/>
+            <w:tcW w:type="dxa" w:w="1152"/>
           </w:tcPr>
           <w:p>
             <w:r/>
@@ -647,7 +635,7 @@
         </w:tc>
         <w:tc>
           <w:tcPr>
-            <w:tcW w:type="dxa" w:w="2880"/>
+            <w:tcW w:type="dxa" w:w="2952"/>
           </w:tcPr>
           <w:p>
             <w:r/>
@@ -655,7 +643,7 @@
               <w:rPr>
                 <w:sz w:val="18"/>
               </w:rPr>
-              <w:t>Pro-rata to revenue</w:t>
+              <w:t>Split in proportion to revenue</w:t>
             </w:r>
           </w:p>
         </w:tc>
@@ -663,7 +651,7 @@
       <w:tr>
         <w:tc>
           <w:tcPr>
-            <w:tcW w:type="dxa" w:w="3744"/>
+            <w:tcW w:type="dxa" w:w="3888"/>
             <w:shd w:val="clear" w:fill="eef2f8"/>
           </w:tcPr>
           <w:p>
@@ -679,7 +667,7 @@
         </w:tc>
         <w:tc>
           <w:tcPr>
-            <w:tcW w:type="dxa" w:w="1224"/>
+            <w:tcW w:type="dxa" w:w="1152"/>
             <w:shd w:val="clear" w:fill="eef2f8"/>
           </w:tcPr>
           <w:p>
@@ -695,7 +683,7 @@
         </w:tc>
         <w:tc>
           <w:tcPr>
-            <w:tcW w:type="dxa" w:w="1224"/>
+            <w:tcW w:type="dxa" w:w="1152"/>
             <w:shd w:val="clear" w:fill="eef2f8"/>
           </w:tcPr>
           <w:p>
@@ -711,7 +699,7 @@
         </w:tc>
         <w:tc>
           <w:tcPr>
-            <w:tcW w:type="dxa" w:w="1224"/>
+            <w:tcW w:type="dxa" w:w="1152"/>
             <w:shd w:val="clear" w:fill="eef2f8"/>
           </w:tcPr>
           <w:p>
@@ -727,7 +715,7 @@
         </w:tc>
         <w:tc>
           <w:tcPr>
-            <w:tcW w:type="dxa" w:w="2880"/>
+            <w:tcW w:type="dxa" w:w="2952"/>
             <w:shd w:val="clear" w:fill="eef2f8"/>
           </w:tcPr>
           <w:p>
@@ -737,7 +725,7 @@
                 <w:b/>
                 <w:sz w:val="18"/>
               </w:rPr>
-              <w:t>= group operating loss</w:t>
+              <w:t>This equals the group operating loss</w:t>
             </w:r>
           </w:p>
         </w:tc>
@@ -745,7 +733,7 @@
       <w:tr>
         <w:tc>
           <w:tcPr>
-            <w:tcW w:type="dxa" w:w="3744"/>
+            <w:tcW w:type="dxa" w:w="3888"/>
             <w:shd w:val="clear" w:fill="eef2f8"/>
           </w:tcPr>
           <w:p>
@@ -761,7 +749,7 @@
         </w:tc>
         <w:tc>
           <w:tcPr>
-            <w:tcW w:type="dxa" w:w="1224"/>
+            <w:tcW w:type="dxa" w:w="1152"/>
             <w:shd w:val="clear" w:fill="eef2f8"/>
           </w:tcPr>
           <w:p>
@@ -777,7 +765,7 @@
         </w:tc>
         <w:tc>
           <w:tcPr>
-            <w:tcW w:type="dxa" w:w="1224"/>
+            <w:tcW w:type="dxa" w:w="1152"/>
             <w:shd w:val="clear" w:fill="eef2f8"/>
           </w:tcPr>
           <w:p>
@@ -793,7 +781,7 @@
         </w:tc>
         <w:tc>
           <w:tcPr>
-            <w:tcW w:type="dxa" w:w="1224"/>
+            <w:tcW w:type="dxa" w:w="1152"/>
             <w:shd w:val="clear" w:fill="eef2f8"/>
           </w:tcPr>
           <w:p>
@@ -809,7 +797,7 @@
         </w:tc>
         <w:tc>
           <w:tcPr>
-            <w:tcW w:type="dxa" w:w="2880"/>
+            <w:tcW w:type="dxa" w:w="2952"/>
             <w:shd w:val="clear" w:fill="eef2f8"/>
           </w:tcPr>
           <w:p>
@@ -819,7 +807,7 @@
                 <w:b/>
                 <w:sz w:val="18"/>
               </w:rPr>
-              <w:t>Divisional, excl. group finance income</w:t>
+              <w:t>Excludes the group’s finance income and expense</w:t>
             </w:r>
           </w:p>
         </w:tc>
@@ -827,7 +815,7 @@
       <w:tr>
         <w:tc>
           <w:tcPr>
-            <w:tcW w:type="dxa" w:w="3744"/>
+            <w:tcW w:type="dxa" w:w="3888"/>
           </w:tcPr>
           <w:p>
             <w:r/>
@@ -841,7 +829,7 @@
         </w:tc>
         <w:tc>
           <w:tcPr>
-            <w:tcW w:type="dxa" w:w="1224"/>
+            <w:tcW w:type="dxa" w:w="1152"/>
           </w:tcPr>
           <w:p>
             <w:r/>
@@ -855,7 +843,7 @@
         </w:tc>
         <w:tc>
           <w:tcPr>
-            <w:tcW w:type="dxa" w:w="1224"/>
+            <w:tcW w:type="dxa" w:w="1152"/>
           </w:tcPr>
           <w:p>
             <w:r/>
@@ -869,7 +857,7 @@
         </w:tc>
         <w:tc>
           <w:tcPr>
-            <w:tcW w:type="dxa" w:w="1224"/>
+            <w:tcW w:type="dxa" w:w="1152"/>
           </w:tcPr>
           <w:p>
             <w:r/>
@@ -883,7 +871,7 @@
         </w:tc>
         <w:tc>
           <w:tcPr>
-            <w:tcW w:type="dxa" w:w="2880"/>
+            <w:tcW w:type="dxa" w:w="2952"/>
           </w:tcPr>
           <w:p>
             <w:r/>
@@ -891,7 +879,7 @@
               <w:rPr>
                 <w:sz w:val="18"/>
               </w:rPr>
-              <w:t>Pro-rata to revenue</w:t>
+              <w:t>Split in proportion to revenue</w:t>
             </w:r>
           </w:p>
         </w:tc>
@@ -899,7 +887,7 @@
       <w:tr>
         <w:tc>
           <w:tcPr>
-            <w:tcW w:type="dxa" w:w="3744"/>
+            <w:tcW w:type="dxa" w:w="3888"/>
           </w:tcPr>
           <w:p>
             <w:r/>
@@ -907,13 +895,13 @@
               <w:rPr>
                 <w:sz w:val="18"/>
               </w:rPr>
-              <w:t>ROI  (NOPAT ÷ net investment)</w:t>
+              <w:t>Return on investment (NOPAT ÷ net investment)</w:t>
             </w:r>
           </w:p>
         </w:tc>
         <w:tc>
           <w:tcPr>
-            <w:tcW w:type="dxa" w:w="1224"/>
+            <w:tcW w:type="dxa" w:w="1152"/>
           </w:tcPr>
           <w:p>
             <w:r/>
@@ -927,7 +915,7 @@
         </w:tc>
         <w:tc>
           <w:tcPr>
-            <w:tcW w:type="dxa" w:w="1224"/>
+            <w:tcW w:type="dxa" w:w="1152"/>
           </w:tcPr>
           <w:p>
             <w:r/>
@@ -941,7 +929,7 @@
         </w:tc>
         <w:tc>
           <w:tcPr>
-            <w:tcW w:type="dxa" w:w="1224"/>
+            <w:tcW w:type="dxa" w:w="1152"/>
           </w:tcPr>
           <w:p>
             <w:r/>
@@ -954,7 +942,7 @@
         </w:tc>
         <w:tc>
           <w:tcPr>
-            <w:tcW w:type="dxa" w:w="2880"/>
+            <w:tcW w:type="dxa" w:w="2952"/>
           </w:tcPr>
           <w:p>
             <w:r/>
@@ -962,7 +950,7 @@
               <w:rPr>
                 <w:sz w:val="18"/>
               </w:rPr>
-              <w:t>Both deeply negative</w:t>
+              <w:t>Both returns are deeply negative</w:t>
             </w:r>
           </w:p>
         </w:tc>
@@ -970,7 +958,7 @@
       <w:tr>
         <w:tc>
           <w:tcPr>
-            <w:tcW w:type="dxa" w:w="3744"/>
+            <w:tcW w:type="dxa" w:w="3888"/>
             <w:shd w:val="clear" w:fill="eef2f8"/>
           </w:tcPr>
           <w:p>
@@ -980,13 +968,13 @@
                 <w:b/>
                 <w:sz w:val="18"/>
               </w:rPr>
-              <w:t>Residual income @ 12% WACC</w:t>
+              <w:t>Residual income at a 12% WACC</w:t>
             </w:r>
           </w:p>
         </w:tc>
         <w:tc>
           <w:tcPr>
-            <w:tcW w:type="dxa" w:w="1224"/>
+            <w:tcW w:type="dxa" w:w="1152"/>
             <w:shd w:val="clear" w:fill="eef2f8"/>
           </w:tcPr>
           <w:p>
@@ -1002,7 +990,7 @@
         </w:tc>
         <w:tc>
           <w:tcPr>
-            <w:tcW w:type="dxa" w:w="1224"/>
+            <w:tcW w:type="dxa" w:w="1152"/>
             <w:shd w:val="clear" w:fill="eef2f8"/>
           </w:tcPr>
           <w:p>
@@ -1018,7 +1006,7 @@
         </w:tc>
         <w:tc>
           <w:tcPr>
-            <w:tcW w:type="dxa" w:w="1224"/>
+            <w:tcW w:type="dxa" w:w="1152"/>
             <w:shd w:val="clear" w:fill="eef2f8"/>
           </w:tcPr>
           <w:p>
@@ -1034,7 +1022,7 @@
         </w:tc>
         <w:tc>
           <w:tcPr>
-            <w:tcW w:type="dxa" w:w="2880"/>
+            <w:tcW w:type="dxa" w:w="2952"/>
             <w:shd w:val="clear" w:fill="eef2f8"/>
           </w:tcPr>
           <w:p>
@@ -1044,7 +1032,7 @@
                 <w:b/>
                 <w:sz w:val="18"/>
               </w:rPr>
-              <w:t>NOPAT − (WACC × net investment)</w:t>
+              <w:t>NOPAT minus (WACC × net investment)</w:t>
             </w:r>
           </w:p>
         </w:tc>
@@ -1052,7 +1040,7 @@
       <w:tr>
         <w:tc>
           <w:tcPr>
-            <w:tcW w:type="dxa" w:w="3744"/>
+            <w:tcW w:type="dxa" w:w="3888"/>
             <w:shd w:val="clear" w:fill="eef2f8"/>
           </w:tcPr>
           <w:p>
@@ -1062,13 +1050,13 @@
                 <w:b/>
                 <w:sz w:val="18"/>
               </w:rPr>
-              <w:t>Residual income (risk-adj: M1 12%, M2 14%)</w:t>
+              <w:t>Residual income risk-adjusted (Mine 1 12%, Mine 2 14%)</w:t>
             </w:r>
           </w:p>
         </w:tc>
         <w:tc>
           <w:tcPr>
-            <w:tcW w:type="dxa" w:w="1224"/>
+            <w:tcW w:type="dxa" w:w="1152"/>
             <w:shd w:val="clear" w:fill="eef2f8"/>
           </w:tcPr>
           <w:p>
@@ -1084,7 +1072,7 @@
         </w:tc>
         <w:tc>
           <w:tcPr>
-            <w:tcW w:type="dxa" w:w="1224"/>
+            <w:tcW w:type="dxa" w:w="1152"/>
             <w:shd w:val="clear" w:fill="eef2f8"/>
           </w:tcPr>
           <w:p>
@@ -1100,7 +1088,7 @@
         </w:tc>
         <w:tc>
           <w:tcPr>
-            <w:tcW w:type="dxa" w:w="1224"/>
+            <w:tcW w:type="dxa" w:w="1152"/>
             <w:shd w:val="clear" w:fill="eef2f8"/>
           </w:tcPr>
           <w:p>
@@ -1115,7 +1103,7 @@
         </w:tc>
         <w:tc>
           <w:tcPr>
-            <w:tcW w:type="dxa" w:w="2880"/>
+            <w:tcW w:type="dxa" w:w="2952"/>
             <w:shd w:val="clear" w:fill="eef2f8"/>
           </w:tcPr>
           <w:p>
@@ -1125,7 +1113,7 @@
                 <w:b/>
                 <w:sz w:val="18"/>
               </w:rPr>
-              <w:t>Mine 2 worse once risk-adjusted</w:t>
+              <w:t>Mine 2 is worse once its higher risk is reflected</w:t>
             </w:r>
           </w:p>
         </w:tc>
@@ -1144,93 +1132,83 @@
           <w:color w:val="1F3D6B"/>
           <w:sz w:val="26"/>
         </w:rPr>
-        <w:t>What the per-mine numbers show</w:t>
+        <w:t>What the per-mine numbers are telling us</w:t>
       </w:r>
     </w:p>
     <w:p>
       <w:pPr>
         <w:pStyle w:val="ListBullet"/>
-        <w:spacing w:after="60"/>
+        <w:spacing w:after="80"/>
       </w:pPr>
       <w:r>
         <w:rPr>
-          <w:b/>
+          <w:sz w:val="20"/>
         </w:rPr>
-        <w:t xml:space="preserve">Both mines destroy value. </w:t>
-      </w:r>
-      <w:r>
-        <w:t>ROI is roughly −27% at each mine and residual income is hugely negative — every rand of capital tied up in the mines is earning far below the ~12% it costs. This is the honest basis for reward: on RI/EVA, neither mine has earned a bonus.</w:t>
+        <w:t>Both mines are destroying value. Each mine produces a return on investment of roughly minus 27%, and each produces a large negative residual income, which means that every rand of capital tied up in the mines is earning far less than the roughly 12% that the capital costs. Measured honestly on residual income or economic value added, neither mine has earned a bonus in FY2026.</w:t>
       </w:r>
     </w:p>
     <w:p>
       <w:pPr>
         <w:pStyle w:val="ListBullet"/>
-        <w:spacing w:after="60"/>
+        <w:spacing w:after="80"/>
       </w:pPr>
       <w:r>
         <w:rPr>
-          <w:b/>
+          <w:sz w:val="20"/>
         </w:rPr>
-        <w:t xml:space="preserve">The losses are not only impairments. </w:t>
-      </w:r>
-      <w:r>
-        <w:t>Even BEFORE the R963m impairment, both mines make an operating loss (Mine 1 −R310m; Mine 2 −R158m) — the core mining is under water, so cost-and-price fixes are needed, not just a one-off write-down.</w:t>
+        <w:t>The losses are not caused only by the impairments. Even before the R963m impairment is deducted, both mines are already loss-making at the operating level (Mine 1 loses R310m and Mine 2 loses R158m). This tells us that the core mining operations are under water, so the business needs genuine cost and price improvements, not just a one-off write-down.</w:t>
       </w:r>
     </w:p>
     <w:p>
       <w:pPr>
         <w:pStyle w:val="ListBullet"/>
-        <w:spacing w:after="60"/>
+        <w:spacing w:after="80"/>
       </w:pPr>
       <w:r>
         <w:rPr>
-          <w:b/>
+          <w:sz w:val="20"/>
         </w:rPr>
-        <w:t xml:space="preserve">Mine 2 is the weaker asset — and the gap is understated here. </w:t>
-      </w:r>
-      <w:r>
-        <w:t>On a simple revenue-pro-rata split the two ROIs look similar, but Mine 2’s revenue fell 42% (vs Mine 1’s 28%), it took a large impairment, and its costs are likely stickier (older, lower-grade). Allocating more of the fixed cost to Mine 2, or risk-adjusting its WACC to 14%, pushes its RI down further. This is exactly why the board is "evaluating the future of Mine 2" (Doc 3) — the numbers support a closure / held-for-sale / care-and-maintenance review.</w:t>
+        <w:t>Mine 2 is the weaker asset, and the gap between the two mines is actually understated in this illustration. On a simple revenue-based split the two returns look similar, but Mine 2’s revenue fell by 42% (compared with Mine 1’s 28% fall), it absorbed a large impairment, and its costs are likely to be stickier because it is the older, lower-grade mine. If more of the fixed costs were allocated to Mine 2, or if its higher risk is reflected by using a 14% WACC, its residual income falls even further. This is precisely why the board is "evaluating the future of Mine 2" (Document 3), and the numbers support a review of closure, sale, or care-and-maintenance.</w:t>
       </w:r>
     </w:p>
     <w:p>
       <w:pPr>
         <w:pStyle w:val="ListBullet"/>
-        <w:spacing w:after="60"/>
+        <w:spacing w:after="80"/>
+      </w:pPr>
+      <w:r>
+        <w:rPr>
+          <w:sz w:val="20"/>
+        </w:rPr>
+        <w:t>This has a direct implication for the incentive scheme. If performance were measured properly — per mine, and on residual income, cost per carat and safety — management would not earn a bonus in FY2026. That is the opposite of what the Document 5 KPIs would deliver, and it confirms the "reward for failure" concern raised in the earlier critique.</w:t>
+      </w:r>
+    </w:p>
+    <w:p>
+      <w:pPr>
+        <w:spacing w:before="200" w:after="40"/>
+        <w:pBdr>
+          <w:bottom w:val="single" w:sz="6" w:space="2" w:color="808080"/>
+        </w:pBdr>
       </w:pPr>
       <w:r>
         <w:rPr>
           <w:b/>
+          <w:color w:val="1F3D6B"/>
+          <w:sz w:val="26"/>
         </w:rPr>
-        <w:t xml:space="preserve">Implication for the incentive scheme. </w:t>
-      </w:r>
-      <w:r>
-        <w:t>Measured properly (per mine, on RI/EVA, cost per carat and safety), management would NOT earn a bonus in FY2026 — which is the opposite of what the Document 5 KPIs would deliver, and confirms the "reward for failure" concern.</w:t>
+        <w:t>Important caveat</w:t>
       </w:r>
     </w:p>
     <w:p>
       <w:pPr>
-        <w:spacing w:after="20"/>
-      </w:pPr>
-      <w:r>
-        <w:rPr>
-          <w:b/>
-          <w:i w:val="0"/>
-          <w:sz w:val="22"/>
-        </w:rPr>
-        <w:t>Caveat</w:t>
-      </w:r>
-    </w:p>
-    <w:p>
-      <w:pPr>
+        <w:pStyle w:val="ListBullet"/>
         <w:spacing w:after="80"/>
       </w:pPr>
       <w:r>
         <w:rPr>
-          <w:b w:val="0"/>
-          <w:i w:val="0"/>
-          <w:sz w:val="19"/>
+          <w:sz w:val="20"/>
         </w:rPr>
-        <w:t>These per-mine figures rest on revenue-based allocations because the divisional cost and asset splits are not disclosed. Before advising the client I would request each mine’s balance sheet, its mining costs, and carats recovered/sold, so that cost per carat, realised US$/carat and a true per-mine ROI/RI/EVA can be calculated rather than estimated.</w:t>
+        <w:t>These per-mine figures depend on revenue-based allocations because the divisional cost and asset splits are not disclosed in the pre-release. Before giving the client a firm answer, I would request each mine’s own balance sheet, its actual mining costs, and the carats recovered and sold, so that cost per carat, realised US dollars per carat, and a true per-mine return on investment, residual income and economic value added can be calculated rather than estimated.</w:t>
       </w:r>
     </w:p>
     <w:sectPr>

</xml_diff>

<commit_message>
Per-mine illustration: one sentence per bullet
</commit_message>
<xml_diff>
--- a/APC-2026-Diamante-PerMine-Performance.docx
+++ b/APC-2026-Diamante-PerMine-Performance.docx
@@ -14,15 +14,78 @@
     </w:p>
     <w:p>
       <w:pPr>
+        <w:spacing w:before="200" w:after="40"/>
+        <w:pBdr>
+          <w:bottom w:val="single" w:sz="6" w:space="2" w:color="808080"/>
+        </w:pBdr>
+      </w:pPr>
+      <w:r>
+        <w:rPr>
+          <w:b/>
+          <w:color w:val="1F3D6B"/>
+          <w:sz w:val="26"/>
+        </w:rPr>
+        <w:t>Purpose and basis of this note</w:t>
+      </w:r>
+    </w:p>
+    <w:p>
+      <w:pPr>
+        <w:pStyle w:val="ListBullet"/>
         <w:spacing w:after="80"/>
       </w:pPr>
       <w:r>
         <w:rPr>
-          <w:b w:val="0"/>
-          <w:i/>
-          <w:sz w:val="19"/>
+          <w:sz w:val="20"/>
         </w:rPr>
-        <w:t>This is a companion to the performance-measures note. Because the pre-release only discloses revenue and the non-financial impairment for each mine separately, I have split the remaining lines using clearly-stated assumptions. The figures should therefore be read as an illustration of the method rather than as audited results. All amounts are in R millions.</w:t>
+        <w:t>This is a companion to the performance-measures note.</w:t>
+      </w:r>
+    </w:p>
+    <w:p>
+      <w:pPr>
+        <w:pStyle w:val="ListBullet"/>
+        <w:spacing w:after="80"/>
+      </w:pPr>
+      <w:r>
+        <w:rPr>
+          <w:sz w:val="20"/>
+        </w:rPr>
+        <w:t>It works out the performance of each mine separately, so that Mine 1 and Mine 2 can be compared side by side.</w:t>
+      </w:r>
+    </w:p>
+    <w:p>
+      <w:pPr>
+        <w:pStyle w:val="ListBullet"/>
+        <w:spacing w:after="80"/>
+      </w:pPr>
+      <w:r>
+        <w:rPr>
+          <w:sz w:val="20"/>
+        </w:rPr>
+        <w:t>The pre-release only discloses revenue and the non-financial impairment for each mine, so I have split the remaining lines using clearly-stated assumptions.</w:t>
+      </w:r>
+    </w:p>
+    <w:p>
+      <w:pPr>
+        <w:pStyle w:val="ListBullet"/>
+        <w:spacing w:after="80"/>
+      </w:pPr>
+      <w:r>
+        <w:rPr>
+          <w:sz w:val="20"/>
+        </w:rPr>
+        <w:t>The figures should therefore be read as an illustration of the method, rather than as audited results.</w:t>
+      </w:r>
+    </w:p>
+    <w:p>
+      <w:pPr>
+        <w:pStyle w:val="ListBullet"/>
+        <w:spacing w:after="80"/>
+      </w:pPr>
+      <w:r>
+        <w:rPr>
+          <w:sz w:val="20"/>
+        </w:rPr>
+        <w:t>All amounts are in R millions.</w:t>
       </w:r>
     </w:p>
     <w:p>
@@ -50,7 +113,7 @@
         <w:rPr>
           <w:sz w:val="20"/>
         </w:rPr>
-        <w:t>The following amounts are disclosed for each mine in the pre-release: revenue (Mine 1 earned R1 233m and Mine 2 earned R630m) and the non-financial impairment (R630m was recognised on Mine 1 and R333m on Mine 2).</w:t>
+        <w:t>Revenue is disclosed for each mine (Mine 1 earned R1 233m and Mine 2 earned R630m).</w:t>
       </w:r>
     </w:p>
     <w:p>
@@ -62,7 +125,7 @@
         <w:rPr>
           <w:sz w:val="20"/>
         </w:rPr>
-        <w:t>I have split the remaining shared amounts — the mining costs, the other corporate expenditure, the R207m financial-asset impairment, and the net investment — in proportion to each mine’s revenue (Mine 1 takes 66.2% and Mine 2 takes 33.8%). In a real engagement I would instead ask the client for each mine’s own costs, assets and carats, because a revenue-based split is only an approximation.</w:t>
+        <w:t>The non-financial impairment is also disclosed for each mine (R630m was recognised on Mine 1 and R333m on Mine 2).</w:t>
       </w:r>
     </w:p>
     <w:p>
@@ -74,7 +137,7 @@
         <w:rPr>
           <w:sz w:val="20"/>
         </w:rPr>
-        <w:t>The divisional NOPAT (net operating profit after tax) is calculated as the operating result multiplied by 73% (that is, after 27% tax), and it deliberately excludes the group’s finance income and finance expense, because financing is managed at group level rather than by each mine. This is the reason the two mines’ NOPAT figures add up to (R1 196m) rather than to the group figure of (R979m), which had retained the group’s finance income.</w:t>
+        <w:t>I have split the remaining shared amounts (mining costs, other corporate expenditure, the R207m financial-asset impairment, and the net investment) in proportion to each mine’s revenue.</w:t>
       </w:r>
     </w:p>
     <w:p>
@@ -86,7 +149,79 @@
         <w:rPr>
           <w:sz w:val="20"/>
         </w:rPr>
-        <w:t>I have assumed a weighted average cost of capital (WACC) of 12%. I have also shown Mine 2 at a risk-adjusted WACC of 14%, because it is the older, lower-grade mine whose future is under review and therefore carries more risk.</w:t>
+        <w:t>On that basis Mine 1 takes 66.2% of each shared amount and Mine 2 takes 33.8%.</w:t>
+      </w:r>
+    </w:p>
+    <w:p>
+      <w:pPr>
+        <w:pStyle w:val="ListBullet"/>
+        <w:spacing w:after="80"/>
+      </w:pPr>
+      <w:r>
+        <w:rPr>
+          <w:sz w:val="20"/>
+        </w:rPr>
+        <w:t>In a real engagement I would instead ask the client for each mine’s own costs, assets and carats, because a revenue-based split is only an approximation.</w:t>
+      </w:r>
+    </w:p>
+    <w:p>
+      <w:pPr>
+        <w:pStyle w:val="ListBullet"/>
+        <w:spacing w:after="80"/>
+      </w:pPr>
+      <w:r>
+        <w:rPr>
+          <w:sz w:val="20"/>
+        </w:rPr>
+        <w:t>The divisional NOPAT (net operating profit after tax) is the operating result multiplied by 73%, which is the result after 27% tax.</w:t>
+      </w:r>
+    </w:p>
+    <w:p>
+      <w:pPr>
+        <w:pStyle w:val="ListBullet"/>
+        <w:spacing w:after="80"/>
+      </w:pPr>
+      <w:r>
+        <w:rPr>
+          <w:sz w:val="20"/>
+        </w:rPr>
+        <w:t>The divisional NOPAT deliberately excludes the group’s finance income and finance expense, because financing is managed at group level and not by each mine.</w:t>
+      </w:r>
+    </w:p>
+    <w:p>
+      <w:pPr>
+        <w:pStyle w:val="ListBullet"/>
+        <w:spacing w:after="80"/>
+      </w:pPr>
+      <w:r>
+        <w:rPr>
+          <w:sz w:val="20"/>
+        </w:rPr>
+        <w:t>This is why the two mines’ NOPAT figures add up to (R1 196m), rather than to the group figure of (R979m) which had retained the group’s finance income.</w:t>
+      </w:r>
+    </w:p>
+    <w:p>
+      <w:pPr>
+        <w:pStyle w:val="ListBullet"/>
+        <w:spacing w:after="80"/>
+      </w:pPr>
+      <w:r>
+        <w:rPr>
+          <w:sz w:val="20"/>
+        </w:rPr>
+        <w:t>I have assumed a weighted average cost of capital (WACC) of 12%.</w:t>
+      </w:r>
+    </w:p>
+    <w:p>
+      <w:pPr>
+        <w:pStyle w:val="ListBullet"/>
+        <w:spacing w:after="80"/>
+      </w:pPr>
+      <w:r>
+        <w:rPr>
+          <w:sz w:val="20"/>
+        </w:rPr>
+        <w:t>I have also shown Mine 2 at a risk-adjusted WACC of 14%, because it is the older, lower-grade mine whose future is under review and therefore carries more risk.</w:t>
       </w:r>
     </w:p>
     <w:p>
@@ -1144,7 +1279,7 @@
         <w:rPr>
           <w:sz w:val="20"/>
         </w:rPr>
-        <w:t>Both mines are destroying value. Each mine produces a return on investment of roughly minus 27%, and each produces a large negative residual income, which means that every rand of capital tied up in the mines is earning far less than the roughly 12% that the capital costs. Measured honestly on residual income or economic value added, neither mine has earned a bonus in FY2026.</w:t>
+        <w:t>Both mines are destroying value.</w:t>
       </w:r>
     </w:p>
     <w:p>
@@ -1156,7 +1291,7 @@
         <w:rPr>
           <w:sz w:val="20"/>
         </w:rPr>
-        <w:t>The losses are not caused only by the impairments. Even before the R963m impairment is deducted, both mines are already loss-making at the operating level (Mine 1 loses R310m and Mine 2 loses R158m). This tells us that the core mining operations are under water, so the business needs genuine cost and price improvements, not just a one-off write-down.</w:t>
+        <w:t>Each mine produces a return on investment of roughly minus 27%.</w:t>
       </w:r>
     </w:p>
     <w:p>
@@ -1168,7 +1303,7 @@
         <w:rPr>
           <w:sz w:val="20"/>
         </w:rPr>
-        <w:t>Mine 2 is the weaker asset, and the gap between the two mines is actually understated in this illustration. On a simple revenue-based split the two returns look similar, but Mine 2’s revenue fell by 42% (compared with Mine 1’s 28% fall), it absorbed a large impairment, and its costs are likely to be stickier because it is the older, lower-grade mine. If more of the fixed costs were allocated to Mine 2, or if its higher risk is reflected by using a 14% WACC, its residual income falls even further. This is precisely why the board is "evaluating the future of Mine 2" (Document 3), and the numbers support a review of closure, sale, or care-and-maintenance.</w:t>
+        <w:t>Each mine also produces a large negative residual income.</w:t>
       </w:r>
     </w:p>
     <w:p>
@@ -1180,7 +1315,163 @@
         <w:rPr>
           <w:sz w:val="20"/>
         </w:rPr>
-        <w:t>This has a direct implication for the incentive scheme. If performance were measured properly — per mine, and on residual income, cost per carat and safety — management would not earn a bonus in FY2026. That is the opposite of what the Document 5 KPIs would deliver, and it confirms the "reward for failure" concern raised in the earlier critique.</w:t>
+        <w:t>This means that every rand of capital tied up in the mines is earning far less than the roughly 12% that the capital costs.</w:t>
+      </w:r>
+    </w:p>
+    <w:p>
+      <w:pPr>
+        <w:pStyle w:val="ListBullet"/>
+        <w:spacing w:after="80"/>
+      </w:pPr>
+      <w:r>
+        <w:rPr>
+          <w:sz w:val="20"/>
+        </w:rPr>
+        <w:t>Measured honestly on residual income or economic value added, neither mine has earned a bonus in FY2026.</w:t>
+      </w:r>
+    </w:p>
+    <w:p>
+      <w:pPr>
+        <w:pStyle w:val="ListBullet"/>
+        <w:spacing w:after="80"/>
+      </w:pPr>
+      <w:r>
+        <w:rPr>
+          <w:sz w:val="20"/>
+        </w:rPr>
+        <w:t>The losses are not caused only by the impairments.</w:t>
+      </w:r>
+    </w:p>
+    <w:p>
+      <w:pPr>
+        <w:pStyle w:val="ListBullet"/>
+        <w:spacing w:after="80"/>
+      </w:pPr>
+      <w:r>
+        <w:rPr>
+          <w:sz w:val="20"/>
+        </w:rPr>
+        <w:t>Even before the R963m impairment is deducted, both mines are already loss-making at the operating level (Mine 1 loses R310m and Mine 2 loses R158m).</w:t>
+      </w:r>
+    </w:p>
+    <w:p>
+      <w:pPr>
+        <w:pStyle w:val="ListBullet"/>
+        <w:spacing w:after="80"/>
+      </w:pPr>
+      <w:r>
+        <w:rPr>
+          <w:sz w:val="20"/>
+        </w:rPr>
+        <w:t>This tells us that the core mining operations are under water, so the business needs genuine cost and price improvements, not just a one-off write-down.</w:t>
+      </w:r>
+    </w:p>
+    <w:p>
+      <w:pPr>
+        <w:pStyle w:val="ListBullet"/>
+        <w:spacing w:after="80"/>
+      </w:pPr>
+      <w:r>
+        <w:rPr>
+          <w:sz w:val="20"/>
+        </w:rPr>
+        <w:t>Mine 2 is the weaker asset, and the gap between the two mines is actually understated in this illustration.</w:t>
+      </w:r>
+    </w:p>
+    <w:p>
+      <w:pPr>
+        <w:pStyle w:val="ListBullet"/>
+        <w:spacing w:after="80"/>
+      </w:pPr>
+      <w:r>
+        <w:rPr>
+          <w:sz w:val="20"/>
+        </w:rPr>
+        <w:t>On a simple revenue-based split the two returns look similar.</w:t>
+      </w:r>
+    </w:p>
+    <w:p>
+      <w:pPr>
+        <w:pStyle w:val="ListBullet"/>
+        <w:spacing w:after="80"/>
+      </w:pPr>
+      <w:r>
+        <w:rPr>
+          <w:sz w:val="20"/>
+        </w:rPr>
+        <w:t>However, Mine 2’s revenue fell by 42%, compared with Mine 1’s 28% fall, it absorbed a large impairment, and its costs are likely to be stickier because it is the older, lower-grade mine.</w:t>
+      </w:r>
+    </w:p>
+    <w:p>
+      <w:pPr>
+        <w:pStyle w:val="ListBullet"/>
+        <w:spacing w:after="80"/>
+      </w:pPr>
+      <w:r>
+        <w:rPr>
+          <w:sz w:val="20"/>
+        </w:rPr>
+        <w:t>If more of the fixed costs were allocated to Mine 2, or if its higher risk is reflected by using a 14% WACC, its residual income falls even further.</w:t>
+      </w:r>
+    </w:p>
+    <w:p>
+      <w:pPr>
+        <w:pStyle w:val="ListBullet"/>
+        <w:spacing w:after="80"/>
+      </w:pPr>
+      <w:r>
+        <w:rPr>
+          <w:sz w:val="20"/>
+        </w:rPr>
+        <w:t>This is precisely why the board is evaluating the future of Mine 2 (Document 3).</w:t>
+      </w:r>
+    </w:p>
+    <w:p>
+      <w:pPr>
+        <w:pStyle w:val="ListBullet"/>
+        <w:spacing w:after="80"/>
+      </w:pPr>
+      <w:r>
+        <w:rPr>
+          <w:sz w:val="20"/>
+        </w:rPr>
+        <w:t>The numbers support a review of closure, sale, or care-and-maintenance for Mine 2.</w:t>
+      </w:r>
+    </w:p>
+    <w:p>
+      <w:pPr>
+        <w:pStyle w:val="ListBullet"/>
+        <w:spacing w:after="80"/>
+      </w:pPr>
+      <w:r>
+        <w:rPr>
+          <w:sz w:val="20"/>
+        </w:rPr>
+        <w:t>This has a direct implication for the incentive scheme.</w:t>
+      </w:r>
+    </w:p>
+    <w:p>
+      <w:pPr>
+        <w:pStyle w:val="ListBullet"/>
+        <w:spacing w:after="80"/>
+      </w:pPr>
+      <w:r>
+        <w:rPr>
+          <w:sz w:val="20"/>
+        </w:rPr>
+        <w:t>If performance were measured properly, per mine and on residual income, cost per carat and safety, management would not earn a bonus in FY2026.</w:t>
+      </w:r>
+    </w:p>
+    <w:p>
+      <w:pPr>
+        <w:pStyle w:val="ListBullet"/>
+        <w:spacing w:after="80"/>
+      </w:pPr>
+      <w:r>
+        <w:rPr>
+          <w:sz w:val="20"/>
+        </w:rPr>
+        <w:t>That is the opposite of what the Document 5 KPIs would deliver, and it confirms the "reward for failure" concern raised in the earlier critique.</w:t>
       </w:r>
     </w:p>
     <w:p>
@@ -1208,7 +1499,31 @@
         <w:rPr>
           <w:sz w:val="20"/>
         </w:rPr>
-        <w:t>These per-mine figures depend on revenue-based allocations because the divisional cost and asset splits are not disclosed in the pre-release. Before giving the client a firm answer, I would request each mine’s own balance sheet, its actual mining costs, and the carats recovered and sold, so that cost per carat, realised US dollars per carat, and a true per-mine return on investment, residual income and economic value added can be calculated rather than estimated.</w:t>
+        <w:t>These per-mine figures depend on revenue-based allocations, because the divisional cost and asset splits are not disclosed in the pre-release.</w:t>
+      </w:r>
+    </w:p>
+    <w:p>
+      <w:pPr>
+        <w:pStyle w:val="ListBullet"/>
+        <w:spacing w:after="80"/>
+      </w:pPr>
+      <w:r>
+        <w:rPr>
+          <w:sz w:val="20"/>
+        </w:rPr>
+        <w:t>Before giving the client a firm answer, I would request each mine’s own balance sheet, its actual mining costs, and the carats recovered and sold.</w:t>
+      </w:r>
+    </w:p>
+    <w:p>
+      <w:pPr>
+        <w:pStyle w:val="ListBullet"/>
+        <w:spacing w:after="80"/>
+      </w:pPr>
+      <w:r>
+        <w:rPr>
+          <w:sz w:val="20"/>
+        </w:rPr>
+        <w:t>That data would allow cost per carat, realised US dollars per carat, and a true per-mine return on investment, residual income and economic value added to be calculated rather than estimated.</w:t>
       </w:r>
     </w:p>
     <w:sectPr>

</xml_diff>